<commit_message>
Link chính chuyển sang Cloudflare Workers; web.app chuyển hướng 301
- firebase.json: redirects mọi đường dẫn sang nhat-ky-ba-nhat.hoanganhfallinginlove.workers.dev
- Cập nhật hướng dẫn kỹ thuật và file Word (link mới, quên mật khẩu, màn quản trị mới)

Co-Authored-By: Claude Opus 5.5 <noreply@anthropic.com>
</commit_message>
<xml_diff>
--- a/HUONG-DAN-SU-DUNG.docx
+++ b/HUONG-DAN-SU-DUNG.docx
@@ -90,10 +90,10 @@
             <w:rStyle w:val="Hyperlink"/>
             <w:b/>
             <w:bCs/>
-            <w:sz w:val="30"/>
-            <w:szCs w:val="30"/>
+            <w:sz w:val="24"/>
+            <w:szCs w:val="24"/>
           </w:rPr>
-          <w:t>https://nhat-ky-ba-nhat-94047.web.app</w:t>
+          <w:t>https://nhat-ky-ba-nhat.hoanganhfallinginlove.workers.dev</w:t>
         </w:r>
       </w:hyperlink>
     </w:p>
@@ -129,7 +129,7 @@
     <w:sdt>
       <w:sdtPr>
         <w:alias w:val="Mục lục"/>
-        <w:id w:val="160356575"/>
+        <w:id w:val="2078093502"/>
       </w:sdtPr>
       <w:sdtEndPr/>
       <w:sdtContent>
@@ -152,7 +152,7 @@
           <w:r>
             <w:fldChar w:fldCharType="separate"/>
           </w:r>
-          <w:hyperlink w:anchor="_Toc243471970" w:history="1">
+          <w:hyperlink w:anchor="_Toc243494908" w:history="1">
             <w:r>
               <w:rPr>
                 <w:rStyle w:val="Hyperlink"/>
@@ -176,7 +176,7 @@
               <w:rPr>
                 <w:noProof/>
               </w:rPr>
-              <w:instrText xml:space="preserve"> PAGEREF _Toc243471970 \h </w:instrText>
+              <w:instrText xml:space="preserve"> PAGEREF _Toc243494908 \h </w:instrText>
             </w:r>
             <w:r>
               <w:rPr>
@@ -213,7 +213,7 @@
               <w:noProof/>
             </w:rPr>
           </w:pPr>
-          <w:hyperlink w:anchor="_Toc243471971" w:history="1">
+          <w:hyperlink w:anchor="_Toc243494909" w:history="1">
             <w:r>
               <w:rPr>
                 <w:rStyle w:val="Hyperlink"/>
@@ -237,7 +237,7 @@
               <w:rPr>
                 <w:noProof/>
               </w:rPr>
-              <w:instrText xml:space="preserve"> PAGEREF _Toc243471971 \h </w:instrText>
+              <w:instrText xml:space="preserve"> PAGEREF _Toc243494909 \h </w:instrText>
             </w:r>
             <w:r>
               <w:rPr>
@@ -274,7 +274,7 @@
               <w:noProof/>
             </w:rPr>
           </w:pPr>
-          <w:hyperlink w:anchor="_Toc243471972" w:history="1">
+          <w:hyperlink w:anchor="_Toc243494910" w:history="1">
             <w:r>
               <w:rPr>
                 <w:rStyle w:val="Hyperlink"/>
@@ -298,7 +298,7 @@
               <w:rPr>
                 <w:noProof/>
               </w:rPr>
-              <w:instrText xml:space="preserve"> PAGEREF _Toc243471972 \h </w:instrText>
+              <w:instrText xml:space="preserve"> PAGEREF _Toc243494910 \h </w:instrText>
             </w:r>
             <w:r>
               <w:rPr>
@@ -335,7 +335,7 @@
               <w:noProof/>
             </w:rPr>
           </w:pPr>
-          <w:hyperlink w:anchor="_Toc243471973" w:history="1">
+          <w:hyperlink w:anchor="_Toc243494911" w:history="1">
             <w:r>
               <w:rPr>
                 <w:rStyle w:val="Hyperlink"/>
@@ -359,7 +359,7 @@
               <w:rPr>
                 <w:noProof/>
               </w:rPr>
-              <w:instrText xml:space="preserve"> PAGEREF _Toc243471973 \h </w:instrText>
+              <w:instrText xml:space="preserve"> PAGEREF _Toc243494911 \h </w:instrText>
             </w:r>
             <w:r>
               <w:rPr>
@@ -396,7 +396,7 @@
               <w:noProof/>
             </w:rPr>
           </w:pPr>
-          <w:hyperlink w:anchor="_Toc243471974" w:history="1">
+          <w:hyperlink w:anchor="_Toc243494912" w:history="1">
             <w:r>
               <w:rPr>
                 <w:rStyle w:val="Hyperlink"/>
@@ -420,7 +420,7 @@
               <w:rPr>
                 <w:noProof/>
               </w:rPr>
-              <w:instrText xml:space="preserve"> PAGEREF _Toc243471974 \h </w:instrText>
+              <w:instrText xml:space="preserve"> PAGEREF _Toc243494912 \h </w:instrText>
             </w:r>
             <w:r>
               <w:rPr>
@@ -457,7 +457,7 @@
               <w:noProof/>
             </w:rPr>
           </w:pPr>
-          <w:hyperlink w:anchor="_Toc243471975" w:history="1">
+          <w:hyperlink w:anchor="_Toc243494913" w:history="1">
             <w:r>
               <w:rPr>
                 <w:rStyle w:val="Hyperlink"/>
@@ -481,7 +481,7 @@
               <w:rPr>
                 <w:noProof/>
               </w:rPr>
-              <w:instrText xml:space="preserve"> PAGEREF _Toc243471975 \h </w:instrText>
+              <w:instrText xml:space="preserve"> PAGEREF _Toc243494913 \h </w:instrText>
             </w:r>
             <w:r>
               <w:rPr>
@@ -518,13 +518,13 @@
               <w:noProof/>
             </w:rPr>
           </w:pPr>
-          <w:hyperlink w:anchor="_Toc243471976" w:history="1">
+          <w:hyperlink w:anchor="_Toc243494914" w:history="1">
             <w:r>
               <w:rPr>
                 <w:rStyle w:val="Hyperlink"/>
                 <w:noProof/>
               </w:rPr>
-              <w:t>3.4. Một số thông báo lỗi thường gặp</w:t>
+              <w:t>3.4. Quên mật khẩu</w:t>
             </w:r>
             <w:r>
               <w:rPr>
@@ -542,7 +542,68 @@
               <w:rPr>
                 <w:noProof/>
               </w:rPr>
-              <w:instrText xml:space="preserve"> PAGEREF _Toc243471976 \h </w:instrText>
+              <w:instrText xml:space="preserve"> PAGEREF _Toc243494914 \h </w:instrText>
+            </w:r>
+            <w:r>
+              <w:rPr>
+                <w:noProof/>
+              </w:rPr>
+            </w:r>
+            <w:r>
+              <w:rPr>
+                <w:noProof/>
+              </w:rPr>
+              <w:fldChar w:fldCharType="separate"/>
+            </w:r>
+            <w:r>
+              <w:rPr>
+                <w:noProof/>
+              </w:rPr>
+              <w:t>4</w:t>
+            </w:r>
+            <w:r>
+              <w:rPr>
+                <w:noProof/>
+              </w:rPr>
+              <w:fldChar w:fldCharType="end"/>
+            </w:r>
+          </w:hyperlink>
+        </w:p>
+        <w:p>
+          <w:pPr>
+            <w:pStyle w:val="TOC2"/>
+            <w:tabs>
+              <w:tab w:val="right" w:leader="dot" w:pos="8996"/>
+            </w:tabs>
+            <w:rPr>
+              <w:noProof/>
+            </w:rPr>
+          </w:pPr>
+          <w:hyperlink w:anchor="_Toc243494915" w:history="1">
+            <w:r>
+              <w:rPr>
+                <w:rStyle w:val="Hyperlink"/>
+                <w:noProof/>
+              </w:rPr>
+              <w:t>3.5. Một số thông báo lỗi thường gặp</w:t>
+            </w:r>
+            <w:r>
+              <w:rPr>
+                <w:noProof/>
+              </w:rPr>
+              <w:tab/>
+            </w:r>
+            <w:r>
+              <w:rPr>
+                <w:noProof/>
+              </w:rPr>
+              <w:fldChar w:fldCharType="begin"/>
+            </w:r>
+            <w:r>
+              <w:rPr>
+                <w:noProof/>
+              </w:rPr>
+              <w:instrText xml:space="preserve"> PAGEREF _Toc243494915 \h </w:instrText>
             </w:r>
             <w:r>
               <w:rPr>
@@ -579,7 +640,7 @@
               <w:noProof/>
             </w:rPr>
           </w:pPr>
-          <w:hyperlink w:anchor="_Toc243471977" w:history="1">
+          <w:hyperlink w:anchor="_Toc243494916" w:history="1">
             <w:r>
               <w:rPr>
                 <w:rStyle w:val="Hyperlink"/>
@@ -603,7 +664,7 @@
               <w:rPr>
                 <w:noProof/>
               </w:rPr>
-              <w:instrText xml:space="preserve"> PAGEREF _Toc243471977 \h </w:instrText>
+              <w:instrText xml:space="preserve"> PAGEREF _Toc243494916 \h </w:instrText>
             </w:r>
             <w:r>
               <w:rPr>
@@ -640,7 +701,7 @@
               <w:noProof/>
             </w:rPr>
           </w:pPr>
-          <w:hyperlink w:anchor="_Toc243471978" w:history="1">
+          <w:hyperlink w:anchor="_Toc243494917" w:history="1">
             <w:r>
               <w:rPr>
                 <w:rStyle w:val="Hyperlink"/>
@@ -664,7 +725,7 @@
               <w:rPr>
                 <w:noProof/>
               </w:rPr>
-              <w:instrText xml:space="preserve"> PAGEREF _Toc243471978 \h </w:instrText>
+              <w:instrText xml:space="preserve"> PAGEREF _Toc243494917 \h </w:instrText>
             </w:r>
             <w:r>
               <w:rPr>
@@ -681,7 +742,7 @@
               <w:rPr>
                 <w:noProof/>
               </w:rPr>
-              <w:t>4</w:t>
+              <w:t>5</w:t>
             </w:r>
             <w:r>
               <w:rPr>
@@ -701,7 +762,7 @@
               <w:noProof/>
             </w:rPr>
           </w:pPr>
-          <w:hyperlink w:anchor="_Toc243471979" w:history="1">
+          <w:hyperlink w:anchor="_Toc243494918" w:history="1">
             <w:r>
               <w:rPr>
                 <w:rStyle w:val="Hyperlink"/>
@@ -725,7 +786,7 @@
               <w:rPr>
                 <w:noProof/>
               </w:rPr>
-              <w:instrText xml:space="preserve"> PAGEREF _Toc243471979 \h </w:instrText>
+              <w:instrText xml:space="preserve"> PAGEREF _Toc243494918 \h </w:instrText>
             </w:r>
             <w:r>
               <w:rPr>
@@ -762,7 +823,7 @@
               <w:noProof/>
             </w:rPr>
           </w:pPr>
-          <w:hyperlink w:anchor="_Toc243471980" w:history="1">
+          <w:hyperlink w:anchor="_Toc243494919" w:history="1">
             <w:r>
               <w:rPr>
                 <w:rStyle w:val="Hyperlink"/>
@@ -786,7 +847,7 @@
               <w:rPr>
                 <w:noProof/>
               </w:rPr>
-              <w:instrText xml:space="preserve"> PAGEREF _Toc243471980 \h </w:instrText>
+              <w:instrText xml:space="preserve"> PAGEREF _Toc243494919 \h </w:instrText>
             </w:r>
             <w:r>
               <w:rPr>
@@ -803,7 +864,7 @@
               <w:rPr>
                 <w:noProof/>
               </w:rPr>
-              <w:t>5</w:t>
+              <w:t>6</w:t>
             </w:r>
             <w:r>
               <w:rPr>
@@ -823,7 +884,7 @@
               <w:noProof/>
             </w:rPr>
           </w:pPr>
-          <w:hyperlink w:anchor="_Toc243471981" w:history="1">
+          <w:hyperlink w:anchor="_Toc243494920" w:history="1">
             <w:r>
               <w:rPr>
                 <w:rStyle w:val="Hyperlink"/>
@@ -847,7 +908,7 @@
               <w:rPr>
                 <w:noProof/>
               </w:rPr>
-              <w:instrText xml:space="preserve"> PAGEREF _Toc243471981 \h </w:instrText>
+              <w:instrText xml:space="preserve"> PAGEREF _Toc243494920 \h </w:instrText>
             </w:r>
             <w:r>
               <w:rPr>
@@ -884,7 +945,7 @@
               <w:noProof/>
             </w:rPr>
           </w:pPr>
-          <w:hyperlink w:anchor="_Toc243471982" w:history="1">
+          <w:hyperlink w:anchor="_Toc243494921" w:history="1">
             <w:r>
               <w:rPr>
                 <w:rStyle w:val="Hyperlink"/>
@@ -908,7 +969,7 @@
               <w:rPr>
                 <w:noProof/>
               </w:rPr>
-              <w:instrText xml:space="preserve"> PAGEREF _Toc243471982 \h </w:instrText>
+              <w:instrText xml:space="preserve"> PAGEREF _Toc243494921 \h </w:instrText>
             </w:r>
             <w:r>
               <w:rPr>
@@ -945,7 +1006,7 @@
               <w:noProof/>
             </w:rPr>
           </w:pPr>
-          <w:hyperlink w:anchor="_Toc243471983" w:history="1">
+          <w:hyperlink w:anchor="_Toc243494922" w:history="1">
             <w:r>
               <w:rPr>
                 <w:rStyle w:val="Hyperlink"/>
@@ -969,7 +1030,7 @@
               <w:rPr>
                 <w:noProof/>
               </w:rPr>
-              <w:instrText xml:space="preserve"> PAGEREF _Toc243471983 \h </w:instrText>
+              <w:instrText xml:space="preserve"> PAGEREF _Toc243494922 \h </w:instrText>
             </w:r>
             <w:r>
               <w:rPr>
@@ -1006,7 +1067,7 @@
               <w:noProof/>
             </w:rPr>
           </w:pPr>
-          <w:hyperlink w:anchor="_Toc243471984" w:history="1">
+          <w:hyperlink w:anchor="_Toc243494923" w:history="1">
             <w:r>
               <w:rPr>
                 <w:rStyle w:val="Hyperlink"/>
@@ -1030,7 +1091,7 @@
               <w:rPr>
                 <w:noProof/>
               </w:rPr>
-              <w:instrText xml:space="preserve"> PAGEREF _Toc243471984 \h </w:instrText>
+              <w:instrText xml:space="preserve"> PAGEREF _Toc243494923 \h </w:instrText>
             </w:r>
             <w:r>
               <w:rPr>
@@ -1067,7 +1128,7 @@
               <w:noProof/>
             </w:rPr>
           </w:pPr>
-          <w:hyperlink w:anchor="_Toc243471985" w:history="1">
+          <w:hyperlink w:anchor="_Toc243494924" w:history="1">
             <w:r>
               <w:rPr>
                 <w:rStyle w:val="Hyperlink"/>
@@ -1091,7 +1152,7 @@
               <w:rPr>
                 <w:noProof/>
               </w:rPr>
-              <w:instrText xml:space="preserve"> PAGEREF _Toc243471985 \h </w:instrText>
+              <w:instrText xml:space="preserve"> PAGEREF _Toc243494924 \h </w:instrText>
             </w:r>
             <w:r>
               <w:rPr>
@@ -1130,7 +1191,7 @@
         <w:pStyle w:val="Heading1"/>
         <w:pageBreakBefore/>
       </w:pPr>
-      <w:bookmarkStart w:id="0" w:name="_Toc243471970"/>
+      <w:bookmarkStart w:id="0" w:name="_Toc243494908"/>
       <w:r>
         <w:t>1. Giới thiệu</w:t>
       </w:r>
@@ -1216,7 +1277,7 @@
       <w:pPr>
         <w:pStyle w:val="Heading1"/>
       </w:pPr>
-      <w:bookmarkStart w:id="1" w:name="_Toc243471971"/>
+      <w:bookmarkStart w:id="1" w:name="_Toc243494909"/>
       <w:r>
         <w:t>2. Truy cập trang</w:t>
       </w:r>
@@ -1346,7 +1407,7 @@
           </w:tcPr>
           <w:p>
             <w:r>
-              <w:t>https://nhat-ky-ba-nhat-94047.web.app</w:t>
+              <w:t>https://nhat-ky-ba-nhat.hoanganhfallinginlove.workers.dev</w:t>
             </w:r>
           </w:p>
         </w:tc>
@@ -1477,7 +1538,7 @@
                 <w:b/>
                 <w:bCs/>
               </w:rPr>
-              <w:t>Cài đặt</w:t>
+              <w:t>Địa chỉ cũ</w:t>
             </w:r>
           </w:p>
         </w:tc>
@@ -1499,6 +1560,57 @@
           </w:tcPr>
           <w:p>
             <w:r>
+              <w:t>https://nhat-ky-ba-nhat-94047.web.app vẫn dùng được, tự chuyển sang địa chỉ mới</w:t>
+            </w:r>
+          </w:p>
+        </w:tc>
+      </w:tr>
+      <w:tr>
+        <w:tc>
+          <w:tcPr>
+            <w:tcW w:w="2800" w:type="dxa"/>
+            <w:tcBorders>
+              <w:top w:val="single" w:sz="4" w:space="0" w:color="D9D9D9"/>
+              <w:left w:val="single" w:sz="4" w:space="0" w:color="D9D9D9"/>
+              <w:bottom w:val="single" w:sz="4" w:space="0" w:color="D9D9D9"/>
+              <w:right w:val="single" w:sz="4" w:space="0" w:color="D9D9D9"/>
+            </w:tcBorders>
+            <w:shd w:val="clear" w:color="auto" w:fill="F7F3EA"/>
+            <w:tcMar>
+              <w:top w:w="80" w:type="dxa"/>
+              <w:left w:w="120" w:type="dxa"/>
+              <w:bottom w:w="80" w:type="dxa"/>
+              <w:right w:w="120" w:type="dxa"/>
+            </w:tcMar>
+          </w:tcPr>
+          <w:p>
+            <w:r>
+              <w:rPr>
+                <w:b/>
+                <w:bCs/>
+              </w:rPr>
+              <w:t>Cài đặt</w:t>
+            </w:r>
+          </w:p>
+        </w:tc>
+        <w:tc>
+          <w:tcPr>
+            <w:tcW w:w="6226" w:type="dxa"/>
+            <w:tcBorders>
+              <w:top w:val="single" w:sz="4" w:space="0" w:color="D9D9D9"/>
+              <w:left w:val="single" w:sz="4" w:space="0" w:color="D9D9D9"/>
+              <w:bottom w:val="single" w:sz="4" w:space="0" w:color="D9D9D9"/>
+              <w:right w:val="single" w:sz="4" w:space="0" w:color="D9D9D9"/>
+            </w:tcBorders>
+            <w:tcMar>
+              <w:top w:w="80" w:type="dxa"/>
+              <w:left w:w="120" w:type="dxa"/>
+              <w:bottom w:w="80" w:type="dxa"/>
+              <w:right w:w="120" w:type="dxa"/>
+            </w:tcMar>
+          </w:tcPr>
+          <w:p>
+            <w:r>
               <w:t>Không cần cài đặt; mở địa chỉ trên bằng trình duyệt là dùng được</w:t>
             </w:r>
           </w:p>
@@ -1542,7 +1654,7 @@
       <w:pPr>
         <w:pStyle w:val="Heading1"/>
       </w:pPr>
-      <w:bookmarkStart w:id="2" w:name="_Toc243471972"/>
+      <w:bookmarkStart w:id="2" w:name="_Toc243494910"/>
       <w:r>
         <w:t>3. Đăng ký và đăng nhập</w:t>
       </w:r>
@@ -1570,7 +1682,7 @@
       <w:pPr>
         <w:pStyle w:val="Heading2"/>
       </w:pPr>
-      <w:bookmarkStart w:id="3" w:name="_Toc243471973"/>
+      <w:bookmarkStart w:id="3" w:name="_Toc243494911"/>
       <w:r>
         <w:t>3.1. Đăng ký tài khoản (lần đầu)</w:t>
       </w:r>
@@ -1679,7 +1791,7 @@
       <w:pPr>
         <w:pStyle w:val="Heading2"/>
       </w:pPr>
-      <w:bookmarkStart w:id="4" w:name="_Toc243471974"/>
+      <w:bookmarkStart w:id="4" w:name="_Toc243494912"/>
       <w:r>
         <w:t>3.2. Đăng nhập (các lần sau)</w:t>
       </w:r>
@@ -1735,7 +1847,7 @@
       <w:pPr>
         <w:pStyle w:val="Heading2"/>
       </w:pPr>
-      <w:bookmarkStart w:id="5" w:name="_Toc243471975"/>
+      <w:bookmarkStart w:id="5" w:name="_Toc243494913"/>
       <w:r>
         <w:t>3.3. Đăng xuất</w:t>
       </w:r>
@@ -1757,6 +1869,108 @@
       </w:r>
       <w:r>
         <w:t xml:space="preserve"> cạnh dòng Xin chào. Nên đăng xuất khi dùng máy tính chung.</w:t>
+      </w:r>
+    </w:p>
+    <w:p>
+      <w:pPr>
+        <w:pStyle w:val="Heading2"/>
+      </w:pPr>
+      <w:bookmarkStart w:id="6" w:name="_Toc243494914"/>
+      <w:r>
+        <w:t>3.4. Quên mật khẩu</w:t>
+      </w:r>
+      <w:bookmarkEnd w:id="6"/>
+    </w:p>
+    <w:p>
+      <w:pPr>
+        <w:pStyle w:val="ListParagraph"/>
+        <w:numPr>
+          <w:ilvl w:val="0"/>
+          <w:numId w:val="5"/>
+        </w:numPr>
+        <w:spacing w:after="80"/>
+      </w:pPr>
+      <w:r>
+        <w:t xml:space="preserve">Ở tab </w:t>
+      </w:r>
+      <w:r>
+        <w:rPr>
+          <w:b/>
+          <w:bCs/>
+        </w:rPr>
+        <w:t>Đăng nhập</w:t>
+      </w:r>
+      <w:r>
+        <w:t xml:space="preserve">, nhập </w:t>
+      </w:r>
+      <w:r>
+        <w:rPr>
+          <w:b/>
+          <w:bCs/>
+        </w:rPr>
+        <w:t>Email</w:t>
+      </w:r>
+      <w:r>
+        <w:t xml:space="preserve"> đã đăng ký vào ô Email.</w:t>
+      </w:r>
+    </w:p>
+    <w:p>
+      <w:pPr>
+        <w:pStyle w:val="ListParagraph"/>
+        <w:numPr>
+          <w:ilvl w:val="0"/>
+          <w:numId w:val="5"/>
+        </w:numPr>
+        <w:spacing w:after="80"/>
+      </w:pPr>
+      <w:r>
+        <w:t xml:space="preserve">Bấm dòng </w:t>
+      </w:r>
+      <w:r>
+        <w:rPr>
+          <w:b/>
+          <w:bCs/>
+        </w:rPr>
+        <w:t>Quên mật khẩu?</w:t>
+      </w:r>
+      <w:r>
+        <w:t xml:space="preserve"> dưới nút Đăng nhập.</w:t>
+      </w:r>
+    </w:p>
+    <w:p>
+      <w:pPr>
+        <w:pStyle w:val="ListParagraph"/>
+        <w:numPr>
+          <w:ilvl w:val="0"/>
+          <w:numId w:val="5"/>
+        </w:numPr>
+        <w:spacing w:after="80"/>
+      </w:pPr>
+      <w:r>
+        <w:t xml:space="preserve">Mở hộp thư email, tìm thư đặt lại mật khẩu (nếu không thấy, xem mục </w:t>
+      </w:r>
+      <w:r>
+        <w:rPr>
+          <w:b/>
+          <w:bCs/>
+        </w:rPr>
+        <w:t>Thư rác/Spam</w:t>
+      </w:r>
+      <w:r>
+        <w:t>). Bấm vào đường link trong thư.</w:t>
+      </w:r>
+    </w:p>
+    <w:p>
+      <w:pPr>
+        <w:pStyle w:val="ListParagraph"/>
+        <w:numPr>
+          <w:ilvl w:val="0"/>
+          <w:numId w:val="5"/>
+        </w:numPr>
+        <w:spacing w:after="80"/>
+      </w:pPr>
+      <w:r>
+        <w:t>Nhập mật khẩu mới, lưu lại, rồi quay về trang đăng nhập bằng mật khẩu mới.</w:t>
       </w:r>
     </w:p>
     <w:p>
@@ -1777,18 +1991,18 @@
         <w:t xml:space="preserve">Lưu ý: </w:t>
       </w:r>
       <w:r>
-        <w:t>Hãy ghi nhớ email và mật khẩu. Trang hiện chưa có chức năng tự lấy lại mật khẩu; nếu quên, liên hệ quản trị viên của đơn vị để được hỗ trợ.</w:t>
+        <w:t>Thư đặt lại mật khẩu chỉ gửi tới email đã đăng ký. Nếu không còn dùng email đó, liên hệ quản trị viên của đơn vị.</w:t>
       </w:r>
     </w:p>
     <w:p>
       <w:pPr>
         <w:pStyle w:val="Heading2"/>
       </w:pPr>
-      <w:bookmarkStart w:id="6" w:name="_Toc243471976"/>
-      <w:r>
-        <w:t>3.4. Một số thông báo lỗi thường gặp</w:t>
-      </w:r>
-      <w:bookmarkEnd w:id="6"/>
+      <w:bookmarkStart w:id="7" w:name="_Toc243494915"/>
+      <w:r>
+        <w:t>3.5. Một số thông báo lỗi thường gặp</w:t>
+      </w:r>
+      <w:bookmarkEnd w:id="7"/>
     </w:p>
     <w:tbl>
       <w:tblPr>
@@ -2128,11 +2342,11 @@
       <w:pPr>
         <w:pStyle w:val="Heading1"/>
       </w:pPr>
-      <w:bookmarkStart w:id="7" w:name="_Toc243471977"/>
+      <w:bookmarkStart w:id="8" w:name="_Toc243494916"/>
       <w:r>
         <w:t>4. Xem cuốn nhật ký</w:t>
       </w:r>
-      <w:bookmarkEnd w:id="7"/>
+      <w:bookmarkEnd w:id="8"/>
     </w:p>
     <w:p>
       <w:pPr>
@@ -2250,18 +2464,18 @@
       <w:pPr>
         <w:pStyle w:val="Heading1"/>
       </w:pPr>
-      <w:bookmarkStart w:id="8" w:name="_Toc243471978"/>
+      <w:bookmarkStart w:id="9" w:name="_Toc243494917"/>
       <w:r>
         <w:t>5. Viết bài nhật ký mới</w:t>
       </w:r>
-      <w:bookmarkEnd w:id="8"/>
+      <w:bookmarkEnd w:id="9"/>
     </w:p>
     <w:p>
       <w:pPr>
         <w:pStyle w:val="ListParagraph"/>
         <w:numPr>
           <w:ilvl w:val="0"/>
-          <w:numId w:val="5"/>
+          <w:numId w:val="6"/>
         </w:numPr>
         <w:spacing w:after="80"/>
       </w:pPr>
@@ -2274,7 +2488,7 @@
         <w:pStyle w:val="ListParagraph"/>
         <w:numPr>
           <w:ilvl w:val="0"/>
-          <w:numId w:val="5"/>
+          <w:numId w:val="6"/>
         </w:numPr>
         <w:spacing w:after="80"/>
       </w:pPr>
@@ -2317,7 +2531,7 @@
         <w:pStyle w:val="ListParagraph"/>
         <w:numPr>
           <w:ilvl w:val="0"/>
-          <w:numId w:val="5"/>
+          <w:numId w:val="6"/>
         </w:numPr>
         <w:spacing w:after="80"/>
       </w:pPr>
@@ -2342,7 +2556,7 @@
         <w:t>Nội dung nhật ký</w:t>
       </w:r>
       <w:r>
-        <w:t>. Nội dung là bắt buộc.</w:t>
+        <w:t>. Nội dung là bắt buộc, tối đa 10.000 ký tự mỗi bài.</w:t>
       </w:r>
     </w:p>
     <w:p>
@@ -2350,7 +2564,7 @@
         <w:pStyle w:val="ListParagraph"/>
         <w:numPr>
           <w:ilvl w:val="0"/>
-          <w:numId w:val="5"/>
+          <w:numId w:val="6"/>
         </w:numPr>
         <w:spacing w:after="80"/>
       </w:pPr>
@@ -2373,7 +2587,7 @@
         <w:pStyle w:val="ListParagraph"/>
         <w:numPr>
           <w:ilvl w:val="0"/>
-          <w:numId w:val="5"/>
+          <w:numId w:val="6"/>
         </w:numPr>
         <w:spacing w:after="80"/>
       </w:pPr>
@@ -2427,18 +2641,28 @@
         <w:t>không công khai cho mọi người</w:t>
       </w:r>
       <w:r>
-        <w:t>. Chỉ bạn và quản trị viên của đơn vị xem được bài của bạn.</w:t>
+        <w:t xml:space="preserve">. Chỉ bạn và quản trị viên của đơn vị xem được bài của bạn. Mỗi cuốn nhật ký chứa tối đa </w:t>
+      </w:r>
+      <w:r>
+        <w:rPr>
+          <w:b/>
+          <w:bCs/>
+        </w:rPr>
+        <w:t>100 bài</w:t>
+      </w:r>
+      <w:r>
+        <w:t>.</w:t>
       </w:r>
     </w:p>
     <w:p>
       <w:pPr>
         <w:pStyle w:val="Heading1"/>
       </w:pPr>
-      <w:bookmarkStart w:id="9" w:name="_Toc243471979"/>
+      <w:bookmarkStart w:id="10" w:name="_Toc243494918"/>
       <w:r>
         <w:t>6. Tải bài về máy</w:t>
       </w:r>
-      <w:bookmarkEnd w:id="9"/>
+      <w:bookmarkEnd w:id="10"/>
     </w:p>
     <w:tbl>
       <w:tblPr>
@@ -2726,11 +2950,11 @@
       <w:pPr>
         <w:pStyle w:val="Heading1"/>
       </w:pPr>
-      <w:bookmarkStart w:id="10" w:name="_Toc243471980"/>
+      <w:bookmarkStart w:id="11" w:name="_Toc243494919"/>
       <w:r>
         <w:t>7. Sửa và xóa bài</w:t>
       </w:r>
-      <w:bookmarkEnd w:id="10"/>
+      <w:bookmarkEnd w:id="11"/>
     </w:p>
     <w:p>
       <w:pPr>
@@ -2834,11 +3058,11 @@
       <w:pPr>
         <w:pStyle w:val="Heading1"/>
       </w:pPr>
-      <w:bookmarkStart w:id="11" w:name="_Toc243471981"/>
+      <w:bookmarkStart w:id="12" w:name="_Toc243494920"/>
       <w:r>
         <w:t>8. Sao lưu bằng file</w:t>
       </w:r>
-      <w:bookmarkEnd w:id="11"/>
+      <w:bookmarkEnd w:id="12"/>
     </w:p>
     <w:p>
       <w:pPr>
@@ -2890,11 +3114,11 @@
       <w:pPr>
         <w:pStyle w:val="Heading1"/>
       </w:pPr>
-      <w:bookmarkStart w:id="12" w:name="_Toc243471982"/>
+      <w:bookmarkStart w:id="13" w:name="_Toc243494921"/>
       <w:r>
         <w:t>9. Lưu trữ dữ liệu</w:t>
       </w:r>
-      <w:bookmarkEnd w:id="12"/>
+      <w:bookmarkEnd w:id="13"/>
     </w:p>
     <w:p>
       <w:pPr>
@@ -2906,7 +3130,17 @@
         <w:spacing w:after="80"/>
       </w:pPr>
       <w:r>
-        <w:t xml:space="preserve">Trang và dữ liệu được đặt trên máy chủ </w:t>
+        <w:t xml:space="preserve">Trang web đặt trên mạng phân phối của </w:t>
+      </w:r>
+      <w:r>
+        <w:rPr>
+          <w:b/>
+          <w:bCs/>
+        </w:rPr>
+        <w:t>Cloudflare</w:t>
+      </w:r>
+      <w:r>
+        <w:t xml:space="preserve">; tài khoản và bài viết lưu trên máy chủ </w:t>
       </w:r>
       <w:r>
         <w:rPr>
@@ -2916,7 +3150,7 @@
         <w:t>Google Firebase</w:t>
       </w:r>
       <w:r>
-        <w:t>, hoạt động liên tục 24/7 và không phụ thuộc vào máy tính của người quản lý.</w:t>
+        <w:t>. Hệ thống hoạt động liên tục 24/7, không phụ thuộc vào máy tính của người quản lý.</w:t>
       </w:r>
     </w:p>
     <w:p>
@@ -2979,18 +3213,38 @@
       <w:pPr>
         <w:pStyle w:val="Heading1"/>
       </w:pPr>
-      <w:bookmarkStart w:id="13" w:name="_Toc243471983"/>
+      <w:bookmarkStart w:id="14" w:name="_Toc243494922"/>
       <w:r>
         <w:t>10. Dành cho quản trị viên</w:t>
       </w:r>
-      <w:bookmarkEnd w:id="13"/>
+      <w:bookmarkEnd w:id="14"/>
     </w:p>
     <w:p>
       <w:pPr>
         <w:spacing w:after="120"/>
       </w:pPr>
       <w:r>
-        <w:t xml:space="preserve">Tài khoản được cấp quyền quản trị sẽ thấy nút </w:t>
+        <w:t xml:space="preserve">Lần đầu, quản trị viên bấm link </w:t>
+      </w:r>
+      <w:r>
+        <w:rPr>
+          <w:b/>
+          <w:bCs/>
+        </w:rPr>
+        <w:t>Quản trị</w:t>
+      </w:r>
+      <w:r>
+        <w:t xml:space="preserve"> ở chân trang (hoặc mở địa chỉ trang có thêm đuôi </w:t>
+      </w:r>
+      <w:r>
+        <w:rPr>
+          <w:b/>
+          <w:bCs/>
+        </w:rPr>
+        <w:t>?admin</w:t>
+      </w:r>
+      <w:r>
+        <w:t xml:space="preserve">) rồi đăng nhập. Từ lần sau, trên máy đó sẽ có sẵn nút </w:t>
       </w:r>
       <w:r>
         <w:rPr>
@@ -3137,7 +3391,7 @@
           </w:tcPr>
           <w:p>
             <w:r>
-              <w:t>Tổng số bài và số người dùng đã viết</w:t>
+              <w:t>Tổng số người dùng và tổng số bài của toàn hệ thống</w:t>
             </w:r>
           </w:p>
         </w:tc>
@@ -3166,7 +3420,7 @@
                 <w:b/>
                 <w:bCs/>
               </w:rPr>
-              <w:t>Tìm kiếm</w:t>
+              <w:t>Tải thêm người dùng</w:t>
             </w:r>
           </w:p>
         </w:tc>
@@ -3188,7 +3442,7 @@
           </w:tcPr>
           <w:p>
             <w:r>
-              <w:t>Tìm theo tiêu đề, nội dung, người viết, email</w:t>
+              <w:t>Danh sách tải 20 người mỗi lần (người mới viết lên đầu); bấm để tải tiếp</w:t>
             </w:r>
           </w:p>
         </w:tc>
@@ -3217,7 +3471,7 @@
                 <w:b/>
                 <w:bCs/>
               </w:rPr>
-              <w:t>Lọc theo người dùng</w:t>
+              <w:t>Tìm theo email</w:t>
             </w:r>
           </w:p>
         </w:tc>
@@ -3239,7 +3493,27 @@
           </w:tcPr>
           <w:p>
             <w:r>
-              <w:t>Chọn một người để xem riêng các bài của người đó</w:t>
+              <w:t xml:space="preserve">Nhập đúng email của một người, bấm </w:t>
+            </w:r>
+            <w:r>
+              <w:rPr>
+                <w:b/>
+                <w:bCs/>
+              </w:rPr>
+              <w:t>Tìm</w:t>
+            </w:r>
+            <w:r>
+              <w:t xml:space="preserve"> để xem các bài của người đó. Bấm </w:t>
+            </w:r>
+            <w:r>
+              <w:rPr>
+                <w:b/>
+                <w:bCs/>
+              </w:rPr>
+              <w:t>Xem tất cả</w:t>
+            </w:r>
+            <w:r>
+              <w:t xml:space="preserve"> để quay lại</w:t>
             </w:r>
           </w:p>
         </w:tc>
@@ -3268,7 +3542,7 @@
                 <w:b/>
                 <w:bCs/>
               </w:rPr>
-              <w:t>Xem</w:t>
+              <w:t>Lọc</w:t>
             </w:r>
           </w:p>
         </w:tc>
@@ -3290,7 +3564,7 @@
           </w:tcPr>
           <w:p>
             <w:r>
-              <w:t>Mở nội dung đầy đủ của bài ngay trong danh sách</w:t>
+              <w:t>Lọc nhanh theo tiêu đề, nội dung, người viết, hoặc chọn một người trong danh sách đang hiển thị</w:t>
             </w:r>
           </w:p>
         </w:tc>
@@ -3319,7 +3593,7 @@
                 <w:b/>
                 <w:bCs/>
               </w:rPr>
-              <w:t>⬇ Ảnh</w:t>
+              <w:t>Xem</w:t>
             </w:r>
           </w:p>
         </w:tc>
@@ -3341,7 +3615,7 @@
           </w:tcPr>
           <w:p>
             <w:r>
-              <w:t>Tải bài thành ảnh PNG</w:t>
+              <w:t>Mở nội dung đầy đủ của bài ngay trong danh sách</w:t>
             </w:r>
           </w:p>
         </w:tc>
@@ -3370,7 +3644,7 @@
                 <w:b/>
                 <w:bCs/>
               </w:rPr>
-              <w:t>Sửa</w:t>
+              <w:t>⬇ Ảnh</w:t>
             </w:r>
           </w:p>
         </w:tc>
@@ -3392,7 +3666,7 @@
           </w:tcPr>
           <w:p>
             <w:r>
-              <w:t>Sửa người viết, ngày, tiêu đề, nội dung; bấm Lưu thay đổi</w:t>
+              <w:t>Tải bài thành ảnh PNG</w:t>
             </w:r>
           </w:p>
         </w:tc>
@@ -3421,7 +3695,7 @@
                 <w:b/>
                 <w:bCs/>
               </w:rPr>
-              <w:t>Xóa</w:t>
+              <w:t>Sửa</w:t>
             </w:r>
           </w:p>
         </w:tc>
@@ -3443,7 +3717,7 @@
           </w:tcPr>
           <w:p>
             <w:r>
-              <w:t>Xóa bài vi phạm hoặc không phù hợp (không khôi phục được)</w:t>
+              <w:t>Sửa người viết, ngày, tiêu đề, nội dung; bấm Lưu thay đổi</w:t>
             </w:r>
           </w:p>
         </w:tc>
@@ -3472,7 +3746,7 @@
                 <w:b/>
                 <w:bCs/>
               </w:rPr>
-              <w:t>⬇ Xuất toàn bộ</w:t>
+              <w:t>Xóa</w:t>
             </w:r>
           </w:p>
         </w:tc>
@@ -3494,7 +3768,58 @@
           </w:tcPr>
           <w:p>
             <w:r>
-              <w:t>Tải toàn bộ bài của mọi người thành file .json để lưu trữ</w:t>
+              <w:t>Xóa bài vi phạm hoặc không phù hợp (không khôi phục được)</w:t>
+            </w:r>
+          </w:p>
+        </w:tc>
+      </w:tr>
+      <w:tr>
+        <w:tc>
+          <w:tcPr>
+            <w:tcW w:w="2800" w:type="dxa"/>
+            <w:tcBorders>
+              <w:top w:val="single" w:sz="4" w:space="0" w:color="D9D9D9"/>
+              <w:left w:val="single" w:sz="4" w:space="0" w:color="D9D9D9"/>
+              <w:bottom w:val="single" w:sz="4" w:space="0" w:color="D9D9D9"/>
+              <w:right w:val="single" w:sz="4" w:space="0" w:color="D9D9D9"/>
+            </w:tcBorders>
+            <w:shd w:val="clear" w:color="auto" w:fill="F7F3EA"/>
+            <w:tcMar>
+              <w:top w:w="80" w:type="dxa"/>
+              <w:left w:w="120" w:type="dxa"/>
+              <w:bottom w:w="80" w:type="dxa"/>
+              <w:right w:w="120" w:type="dxa"/>
+            </w:tcMar>
+          </w:tcPr>
+          <w:p>
+            <w:r>
+              <w:rPr>
+                <w:b/>
+                <w:bCs/>
+              </w:rPr>
+              <w:t>⬇ Xuất danh sách đang hiển thị</w:t>
+            </w:r>
+          </w:p>
+        </w:tc>
+        <w:tc>
+          <w:tcPr>
+            <w:tcW w:w="6226" w:type="dxa"/>
+            <w:tcBorders>
+              <w:top w:val="single" w:sz="4" w:space="0" w:color="D9D9D9"/>
+              <w:left w:val="single" w:sz="4" w:space="0" w:color="D9D9D9"/>
+              <w:bottom w:val="single" w:sz="4" w:space="0" w:color="D9D9D9"/>
+              <w:right w:val="single" w:sz="4" w:space="0" w:color="D9D9D9"/>
+            </w:tcBorders>
+            <w:tcMar>
+              <w:top w:w="80" w:type="dxa"/>
+              <w:left w:w="120" w:type="dxa"/>
+              <w:bottom w:w="80" w:type="dxa"/>
+              <w:right w:w="120" w:type="dxa"/>
+            </w:tcMar>
+          </w:tcPr>
+          <w:p>
+            <w:r>
+              <w:t>Lưu các bài đang hiển thị thành file .json</w:t>
             </w:r>
           </w:p>
         </w:tc>
@@ -3510,25 +3835,35 @@
         <w:spacing w:after="120"/>
       </w:pPr>
       <w:r>
-        <w:t>Danh sách tự cập nhật khi có người đăng, sửa hoặc xóa bài.</w:t>
+        <w:t xml:space="preserve">Bấm </w:t>
+      </w:r>
+      <w:r>
+        <w:rPr>
+          <w:b/>
+          <w:bCs/>
+        </w:rPr>
+        <w:t>Xem tất cả</w:t>
+      </w:r>
+      <w:r>
+        <w:t xml:space="preserve"> để tải lại danh sách mới nhất.</w:t>
       </w:r>
     </w:p>
     <w:p>
       <w:pPr>
         <w:pStyle w:val="Heading2"/>
       </w:pPr>
-      <w:bookmarkStart w:id="14" w:name="_Toc243471984"/>
+      <w:bookmarkStart w:id="15" w:name="_Toc243494923"/>
       <w:r>
         <w:t>10.1. Cấp quyền quản trị cho tài khoản mới</w:t>
       </w:r>
-      <w:bookmarkEnd w:id="14"/>
+      <w:bookmarkEnd w:id="15"/>
     </w:p>
     <w:p>
       <w:pPr>
         <w:pStyle w:val="ListParagraph"/>
         <w:numPr>
           <w:ilvl w:val="0"/>
-          <w:numId w:val="6"/>
+          <w:numId w:val="7"/>
         </w:numPr>
         <w:spacing w:after="80"/>
       </w:pPr>
@@ -3541,7 +3876,7 @@
         <w:pStyle w:val="ListParagraph"/>
         <w:numPr>
           <w:ilvl w:val="0"/>
-          <w:numId w:val="6"/>
+          <w:numId w:val="7"/>
         </w:numPr>
         <w:spacing w:after="80"/>
       </w:pPr>
@@ -3574,7 +3909,7 @@
         <w:pStyle w:val="ListParagraph"/>
         <w:numPr>
           <w:ilvl w:val="0"/>
-          <w:numId w:val="6"/>
+          <w:numId w:val="7"/>
         </w:numPr>
         <w:spacing w:after="80"/>
       </w:pPr>
@@ -3647,23 +3982,33 @@
         <w:pStyle w:val="ListParagraph"/>
         <w:numPr>
           <w:ilvl w:val="0"/>
-          <w:numId w:val="6"/>
+          <w:numId w:val="7"/>
         </w:numPr>
         <w:spacing w:after="80"/>
       </w:pPr>
       <w:r>
-        <w:t>Người được cấp quyền tải lại trang (F5) để thấy nút ⚙ Quản trị. Muốn thu hồi quyền, xóa document đó trong collection admins.</w:t>
+        <w:t xml:space="preserve">Người được cấp quyền bấm link </w:t>
+      </w:r>
+      <w:r>
+        <w:rPr>
+          <w:b/>
+          <w:bCs/>
+        </w:rPr>
+        <w:t>Quản trị</w:t>
+      </w:r>
+      <w:r>
+        <w:t xml:space="preserve"> ở chân trang và đăng nhập để thấy màn quản trị. Muốn thu hồi quyền, xóa document đó trong collection admins.</w:t>
       </w:r>
     </w:p>
     <w:p>
       <w:pPr>
         <w:pStyle w:val="Heading1"/>
       </w:pPr>
-      <w:bookmarkStart w:id="15" w:name="_Toc243471985"/>
+      <w:bookmarkStart w:id="16" w:name="_Toc243494924"/>
       <w:r>
         <w:t>11. Lưu ý chung</w:t>
       </w:r>
-      <w:bookmarkEnd w:id="15"/>
+      <w:bookmarkEnd w:id="16"/>
     </w:p>
     <w:p>
       <w:pPr>
@@ -3879,10 +4224,10 @@
 <file path=word/numbering.xml><?xml version="1.0" encoding="utf-8"?>
 <w:numbering xmlns:wpc="http://schemas.microsoft.com/office/word/2010/wordprocessingCanvas" xmlns:cx="http://schemas.microsoft.com/office/drawing/2014/chartex" xmlns:cx1="http://schemas.microsoft.com/office/drawing/2015/9/8/chartex" xmlns:cx2="http://schemas.microsoft.com/office/drawing/2015/10/21/chartex" xmlns:cx3="http://schemas.microsoft.com/office/drawing/2016/5/9/chartex" xmlns:cx4="http://schemas.microsoft.com/office/drawing/2016/5/10/chartex" xmlns:cx5="http://schemas.microsoft.com/office/drawing/2016/5/11/chartex" xmlns:cx6="http://schemas.microsoft.com/office/drawing/2016/5/12/chartex" xmlns:cx7="http://schemas.microsoft.com/office/drawing/2016/5/13/chartex" xmlns:cx8="http://schemas.microsoft.com/office/drawing/2016/5/14/chartex" xmlns:mc="http://schemas.openxmlformats.org/markup-compatibility/2006" xmlns:aink="http://schemas.microsoft.com/office/drawing/2016/ink" xmlns:am3d="http://schemas.microsoft.com/office/drawing/2017/model3d" xmlns:o="urn:schemas-microsoft-com:office:office" xmlns:oel="http://schemas.microsoft.com/office/2019/extlst" xmlns:r="http://schemas.openxmlformats.org/officeDocument/2006/relationships" xmlns:m="http://schemas.openxmlformats.org/officeDocument/2006/math" xmlns:v="urn:schemas-microsoft-com:vml" xmlns:wp14="http://schemas.microsoft.com/office/word/2010/wordprocessingDrawing" xmlns:wp="http://schemas.openxmlformats.org/drawingml/2006/wordprocessingDrawing" xmlns:w10="urn:schemas-microsoft-com:office:word" xmlns:w="http://schemas.openxmlformats.org/wordprocessingml/2006/main" xmlns:w14="http://schemas.microsoft.com/office/word/2010/wordml" xmlns:w15="http://schemas.microsoft.com/office/word/2012/wordml" xmlns:w16cex="http://schemas.microsoft.com/office/word/2018/wordml/cex" xmlns:w16cid="http://schemas.microsoft.com/office/word/2016/wordml/cid" xmlns:w16="http://schemas.microsoft.com/office/word/2018/wordml" xmlns:w16du="http://schemas.microsoft.com/office/word/2023/wordml/word16du" xmlns:w16sdtdh="http://schemas.microsoft.com/office/word/2020/wordml/sdtdatahash" xmlns:w16sdtfl="http://schemas.microsoft.com/office/word/2024/wordml/sdtformatlock" xmlns:w16se="http://schemas.microsoft.com/office/word/2015/wordml/symex" xmlns:wpg="http://schemas.microsoft.com/office/word/2010/wordprocessingGroup" xmlns:wpi="http://schemas.microsoft.com/office/word/2010/wordprocessingInk" xmlns:wne="http://schemas.microsoft.com/office/word/2006/wordml" xmlns:wps="http://schemas.microsoft.com/office/word/2010/wordprocessingShape" mc:Ignorable="w14 w15 w16se w16cid w16 w16cex w16sdtdh w16sdtfl w16du wp14">
   <w:abstractNum w:abstractNumId="0" w15:restartNumberingAfterBreak="0">
-    <w:nsid w:val="062271CE"/>
+    <w:nsid w:val="0D0123D4"/>
     <w:multiLevelType w:val="hybridMultilevel"/>
-    <w:tmpl w:val="8632C7E0"/>
-    <w:lvl w:ilvl="0" w:tplc="52944AB2">
+    <w:tmpl w:val="83248E18"/>
+    <w:lvl w:ilvl="0" w:tplc="BA5C0C8C">
       <w:start w:val="1"/>
       <w:numFmt w:val="decimal"/>
       <w:lvlText w:val="%1."/>
@@ -3891,52 +4236,214 @@
         <w:ind w:left="640" w:hanging="360"/>
       </w:pPr>
     </w:lvl>
-    <w:lvl w:ilvl="1" w:tplc="DB9A4678">
+    <w:lvl w:ilvl="1" w:tplc="CA2695B4">
       <w:numFmt w:val="decimal"/>
       <w:lvlText w:val=""/>
       <w:lvlJc w:val="left"/>
     </w:lvl>
-    <w:lvl w:ilvl="2" w:tplc="E7F433F2">
+    <w:lvl w:ilvl="2" w:tplc="C66EF4B0">
       <w:numFmt w:val="decimal"/>
       <w:lvlText w:val=""/>
       <w:lvlJc w:val="left"/>
     </w:lvl>
-    <w:lvl w:ilvl="3" w:tplc="23C80D86">
+    <w:lvl w:ilvl="3" w:tplc="A9F25AD8">
       <w:numFmt w:val="decimal"/>
       <w:lvlText w:val=""/>
       <w:lvlJc w:val="left"/>
     </w:lvl>
-    <w:lvl w:ilvl="4" w:tplc="537E9572">
+    <w:lvl w:ilvl="4" w:tplc="83A02454">
       <w:numFmt w:val="decimal"/>
       <w:lvlText w:val=""/>
       <w:lvlJc w:val="left"/>
     </w:lvl>
-    <w:lvl w:ilvl="5" w:tplc="BFC21400">
+    <w:lvl w:ilvl="5" w:tplc="0636BB76">
       <w:numFmt w:val="decimal"/>
       <w:lvlText w:val=""/>
       <w:lvlJc w:val="left"/>
     </w:lvl>
-    <w:lvl w:ilvl="6" w:tplc="8FDE9B60">
+    <w:lvl w:ilvl="6" w:tplc="25A0E4BE">
       <w:numFmt w:val="decimal"/>
       <w:lvlText w:val=""/>
       <w:lvlJc w:val="left"/>
     </w:lvl>
-    <w:lvl w:ilvl="7" w:tplc="45122636">
+    <w:lvl w:ilvl="7" w:tplc="DFA09B34">
       <w:numFmt w:val="decimal"/>
       <w:lvlText w:val=""/>
       <w:lvlJc w:val="left"/>
     </w:lvl>
-    <w:lvl w:ilvl="8" w:tplc="4D96C196">
+    <w:lvl w:ilvl="8" w:tplc="C242F594">
       <w:numFmt w:val="decimal"/>
       <w:lvlText w:val=""/>
       <w:lvlJc w:val="left"/>
     </w:lvl>
   </w:abstractNum>
   <w:abstractNum w:abstractNumId="1" w15:restartNumberingAfterBreak="0">
-    <w:nsid w:val="284C322C"/>
+    <w:nsid w:val="1276730D"/>
     <w:multiLevelType w:val="hybridMultilevel"/>
-    <w:tmpl w:val="5AA49E4C"/>
-    <w:lvl w:ilvl="0" w:tplc="5AA00366" w:tentative="1">
+    <w:tmpl w:val="1D0A4EA0"/>
+    <w:lvl w:ilvl="0" w:tplc="A25E8A62">
+      <w:start w:val="1"/>
+      <w:numFmt w:val="decimal"/>
+      <w:lvlText w:val="%1."/>
+      <w:lvlJc w:val="left"/>
+      <w:pPr>
+        <w:ind w:left="640" w:hanging="360"/>
+      </w:pPr>
+    </w:lvl>
+    <w:lvl w:ilvl="1" w:tplc="50983E82">
+      <w:numFmt w:val="decimal"/>
+      <w:lvlText w:val=""/>
+      <w:lvlJc w:val="left"/>
+    </w:lvl>
+    <w:lvl w:ilvl="2" w:tplc="51CC6724">
+      <w:numFmt w:val="decimal"/>
+      <w:lvlText w:val=""/>
+      <w:lvlJc w:val="left"/>
+    </w:lvl>
+    <w:lvl w:ilvl="3" w:tplc="4E7C3FDA">
+      <w:numFmt w:val="decimal"/>
+      <w:lvlText w:val=""/>
+      <w:lvlJc w:val="left"/>
+    </w:lvl>
+    <w:lvl w:ilvl="4" w:tplc="FACCF832">
+      <w:numFmt w:val="decimal"/>
+      <w:lvlText w:val=""/>
+      <w:lvlJc w:val="left"/>
+    </w:lvl>
+    <w:lvl w:ilvl="5" w:tplc="457E6EDE">
+      <w:numFmt w:val="decimal"/>
+      <w:lvlText w:val=""/>
+      <w:lvlJc w:val="left"/>
+    </w:lvl>
+    <w:lvl w:ilvl="6" w:tplc="BEF09F9A">
+      <w:numFmt w:val="decimal"/>
+      <w:lvlText w:val=""/>
+      <w:lvlJc w:val="left"/>
+    </w:lvl>
+    <w:lvl w:ilvl="7" w:tplc="49AA5F10">
+      <w:numFmt w:val="decimal"/>
+      <w:lvlText w:val=""/>
+      <w:lvlJc w:val="left"/>
+    </w:lvl>
+    <w:lvl w:ilvl="8" w:tplc="5B94A660">
+      <w:numFmt w:val="decimal"/>
+      <w:lvlText w:val=""/>
+      <w:lvlJc w:val="left"/>
+    </w:lvl>
+  </w:abstractNum>
+  <w:abstractNum w:abstractNumId="2" w15:restartNumberingAfterBreak="0">
+    <w:nsid w:val="20367A69"/>
+    <w:multiLevelType w:val="hybridMultilevel"/>
+    <w:tmpl w:val="AEE05DD4"/>
+    <w:lvl w:ilvl="0" w:tplc="FCC22BEA">
+      <w:start w:val="1"/>
+      <w:numFmt w:val="decimal"/>
+      <w:lvlText w:val="%1."/>
+      <w:lvlJc w:val="left"/>
+      <w:pPr>
+        <w:ind w:left="640" w:hanging="360"/>
+      </w:pPr>
+    </w:lvl>
+    <w:lvl w:ilvl="1" w:tplc="FDAA06AE">
+      <w:numFmt w:val="decimal"/>
+      <w:lvlText w:val=""/>
+      <w:lvlJc w:val="left"/>
+    </w:lvl>
+    <w:lvl w:ilvl="2" w:tplc="C54A2460">
+      <w:numFmt w:val="decimal"/>
+      <w:lvlText w:val=""/>
+      <w:lvlJc w:val="left"/>
+    </w:lvl>
+    <w:lvl w:ilvl="3" w:tplc="C95E94DC">
+      <w:numFmt w:val="decimal"/>
+      <w:lvlText w:val=""/>
+      <w:lvlJc w:val="left"/>
+    </w:lvl>
+    <w:lvl w:ilvl="4" w:tplc="447CC1D6">
+      <w:numFmt w:val="decimal"/>
+      <w:lvlText w:val=""/>
+      <w:lvlJc w:val="left"/>
+    </w:lvl>
+    <w:lvl w:ilvl="5" w:tplc="C35C2470">
+      <w:numFmt w:val="decimal"/>
+      <w:lvlText w:val=""/>
+      <w:lvlJc w:val="left"/>
+    </w:lvl>
+    <w:lvl w:ilvl="6" w:tplc="3A96FB74">
+      <w:numFmt w:val="decimal"/>
+      <w:lvlText w:val=""/>
+      <w:lvlJc w:val="left"/>
+    </w:lvl>
+    <w:lvl w:ilvl="7" w:tplc="4306CC38">
+      <w:numFmt w:val="decimal"/>
+      <w:lvlText w:val=""/>
+      <w:lvlJc w:val="left"/>
+    </w:lvl>
+    <w:lvl w:ilvl="8" w:tplc="11F08652">
+      <w:numFmt w:val="decimal"/>
+      <w:lvlText w:val=""/>
+      <w:lvlJc w:val="left"/>
+    </w:lvl>
+  </w:abstractNum>
+  <w:abstractNum w:abstractNumId="3" w15:restartNumberingAfterBreak="0">
+    <w:nsid w:val="275058E0"/>
+    <w:multiLevelType w:val="hybridMultilevel"/>
+    <w:tmpl w:val="C15436EC"/>
+    <w:lvl w:ilvl="0" w:tplc="82628F1C">
+      <w:start w:val="1"/>
+      <w:numFmt w:val="decimal"/>
+      <w:lvlText w:val="%1."/>
+      <w:lvlJc w:val="left"/>
+      <w:pPr>
+        <w:ind w:left="640" w:hanging="360"/>
+      </w:pPr>
+    </w:lvl>
+    <w:lvl w:ilvl="1" w:tplc="88EAFD30">
+      <w:numFmt w:val="decimal"/>
+      <w:lvlText w:val=""/>
+      <w:lvlJc w:val="left"/>
+    </w:lvl>
+    <w:lvl w:ilvl="2" w:tplc="DDD27AC2">
+      <w:numFmt w:val="decimal"/>
+      <w:lvlText w:val=""/>
+      <w:lvlJc w:val="left"/>
+    </w:lvl>
+    <w:lvl w:ilvl="3" w:tplc="D4C64188">
+      <w:numFmt w:val="decimal"/>
+      <w:lvlText w:val=""/>
+      <w:lvlJc w:val="left"/>
+    </w:lvl>
+    <w:lvl w:ilvl="4" w:tplc="63B6D862">
+      <w:numFmt w:val="decimal"/>
+      <w:lvlText w:val=""/>
+      <w:lvlJc w:val="left"/>
+    </w:lvl>
+    <w:lvl w:ilvl="5" w:tplc="DA3CC78E">
+      <w:numFmt w:val="decimal"/>
+      <w:lvlText w:val=""/>
+      <w:lvlJc w:val="left"/>
+    </w:lvl>
+    <w:lvl w:ilvl="6" w:tplc="3FAADF34">
+      <w:numFmt w:val="decimal"/>
+      <w:lvlText w:val=""/>
+      <w:lvlJc w:val="left"/>
+    </w:lvl>
+    <w:lvl w:ilvl="7" w:tplc="6106B6C6">
+      <w:numFmt w:val="decimal"/>
+      <w:lvlText w:val=""/>
+      <w:lvlJc w:val="left"/>
+    </w:lvl>
+    <w:lvl w:ilvl="8" w:tplc="7B5E2976">
+      <w:numFmt w:val="decimal"/>
+      <w:lvlText w:val=""/>
+      <w:lvlJc w:val="left"/>
+    </w:lvl>
+  </w:abstractNum>
+  <w:abstractNum w:abstractNumId="4" w15:restartNumberingAfterBreak="0">
+    <w:nsid w:val="2A0A7C44"/>
+    <w:multiLevelType w:val="hybridMultilevel"/>
+    <w:tmpl w:val="E1785824"/>
+    <w:lvl w:ilvl="0" w:tplc="AF143016" w:tentative="1">
       <w:start w:val="1"/>
       <w:numFmt w:val="bullet"/>
       <w:lvlText w:val="●"/>
@@ -3945,7 +4452,7 @@
         <w:ind w:left="720" w:hanging="360"/>
       </w:pPr>
     </w:lvl>
-    <w:lvl w:ilvl="1" w:tplc="D624AD5C" w:tentative="1">
+    <w:lvl w:ilvl="1" w:tplc="2BA83264" w:tentative="1">
       <w:start w:val="1"/>
       <w:numFmt w:val="bullet"/>
       <w:lvlText w:val="○"/>
@@ -3954,7 +4461,7 @@
         <w:ind w:left="1440" w:hanging="360"/>
       </w:pPr>
     </w:lvl>
-    <w:lvl w:ilvl="2" w:tplc="20D4D2DA" w:tentative="1">
+    <w:lvl w:ilvl="2" w:tplc="B42A5B96" w:tentative="1">
       <w:start w:val="1"/>
       <w:numFmt w:val="bullet"/>
       <w:lvlText w:val="■"/>
@@ -3963,7 +4470,7 @@
         <w:ind w:left="2160" w:hanging="360"/>
       </w:pPr>
     </w:lvl>
-    <w:lvl w:ilvl="3" w:tplc="B3428EAE" w:tentative="1">
+    <w:lvl w:ilvl="3" w:tplc="E7EE329E" w:tentative="1">
       <w:start w:val="1"/>
       <w:numFmt w:val="bullet"/>
       <w:lvlText w:val="●"/>
@@ -3972,7 +4479,7 @@
         <w:ind w:left="2880" w:hanging="360"/>
       </w:pPr>
     </w:lvl>
-    <w:lvl w:ilvl="4" w:tplc="246A751C" w:tentative="1">
+    <w:lvl w:ilvl="4" w:tplc="1F34693A" w:tentative="1">
       <w:start w:val="1"/>
       <w:numFmt w:val="bullet"/>
       <w:lvlText w:val="○"/>
@@ -3981,7 +4488,7 @@
         <w:ind w:left="3600" w:hanging="360"/>
       </w:pPr>
     </w:lvl>
-    <w:lvl w:ilvl="5" w:tplc="13B8003A" w:tentative="1">
+    <w:lvl w:ilvl="5" w:tplc="3F8EAC80" w:tentative="1">
       <w:start w:val="1"/>
       <w:numFmt w:val="bullet"/>
       <w:lvlText w:val="■"/>
@@ -3990,7 +4497,7 @@
         <w:ind w:left="4320" w:hanging="360"/>
       </w:pPr>
     </w:lvl>
-    <w:lvl w:ilvl="6" w:tplc="F86012A2" w:tentative="1">
+    <w:lvl w:ilvl="6" w:tplc="1CEA9F06" w:tentative="1">
       <w:start w:val="1"/>
       <w:numFmt w:val="bullet"/>
       <w:lvlText w:val="●"/>
@@ -3999,7 +4506,7 @@
         <w:ind w:left="5040" w:hanging="360"/>
       </w:pPr>
     </w:lvl>
-    <w:lvl w:ilvl="7" w:tplc="1C007F2E" w:tentative="1">
+    <w:lvl w:ilvl="7" w:tplc="4DD661EC" w:tentative="1">
       <w:start w:val="1"/>
       <w:numFmt w:val="bullet"/>
       <w:lvlText w:val="●"/>
@@ -4008,7 +4515,7 @@
         <w:ind w:left="5760" w:hanging="360"/>
       </w:pPr>
     </w:lvl>
-    <w:lvl w:ilvl="8" w:tplc="A7782612" w:tentative="1">
+    <w:lvl w:ilvl="8" w:tplc="FBB62A80" w:tentative="1">
       <w:start w:val="1"/>
       <w:numFmt w:val="bullet"/>
       <w:lvlText w:val="●"/>
@@ -4018,11 +4525,11 @@
       </w:pPr>
     </w:lvl>
   </w:abstractNum>
-  <w:abstractNum w:abstractNumId="2" w15:restartNumberingAfterBreak="0">
-    <w:nsid w:val="2F417C4A"/>
+  <w:abstractNum w:abstractNumId="5" w15:restartNumberingAfterBreak="0">
+    <w:nsid w:val="2A9B479D"/>
     <w:multiLevelType w:val="hybridMultilevel"/>
-    <w:tmpl w:val="EA6CF0A2"/>
-    <w:lvl w:ilvl="0" w:tplc="0096B780">
+    <w:tmpl w:val="3830D4D8"/>
+    <w:lvl w:ilvl="0" w:tplc="EF52CF52">
       <w:start w:val="1"/>
       <w:numFmt w:val="decimal"/>
       <w:lvlText w:val="%1."/>
@@ -4031,52 +4538,52 @@
         <w:ind w:left="640" w:hanging="360"/>
       </w:pPr>
     </w:lvl>
-    <w:lvl w:ilvl="1" w:tplc="39F605DE">
+    <w:lvl w:ilvl="1" w:tplc="381E6830">
       <w:numFmt w:val="decimal"/>
       <w:lvlText w:val=""/>
       <w:lvlJc w:val="left"/>
     </w:lvl>
-    <w:lvl w:ilvl="2" w:tplc="4FAA96D6">
+    <w:lvl w:ilvl="2" w:tplc="88C80326">
       <w:numFmt w:val="decimal"/>
       <w:lvlText w:val=""/>
       <w:lvlJc w:val="left"/>
     </w:lvl>
-    <w:lvl w:ilvl="3" w:tplc="19D8BDFE">
+    <w:lvl w:ilvl="3" w:tplc="426A601A">
       <w:numFmt w:val="decimal"/>
       <w:lvlText w:val=""/>
       <w:lvlJc w:val="left"/>
     </w:lvl>
-    <w:lvl w:ilvl="4" w:tplc="3C3ADA14">
+    <w:lvl w:ilvl="4" w:tplc="4BA4489E">
       <w:numFmt w:val="decimal"/>
       <w:lvlText w:val=""/>
       <w:lvlJc w:val="left"/>
     </w:lvl>
-    <w:lvl w:ilvl="5" w:tplc="E3C47E0C">
+    <w:lvl w:ilvl="5" w:tplc="4B683662">
       <w:numFmt w:val="decimal"/>
       <w:lvlText w:val=""/>
       <w:lvlJc w:val="left"/>
     </w:lvl>
-    <w:lvl w:ilvl="6" w:tplc="2ABCC20E">
+    <w:lvl w:ilvl="6" w:tplc="C17653FC">
       <w:numFmt w:val="decimal"/>
       <w:lvlText w:val=""/>
       <w:lvlJc w:val="left"/>
     </w:lvl>
-    <w:lvl w:ilvl="7" w:tplc="0E461A80">
+    <w:lvl w:ilvl="7" w:tplc="60E24914">
       <w:numFmt w:val="decimal"/>
       <w:lvlText w:val=""/>
       <w:lvlJc w:val="left"/>
     </w:lvl>
-    <w:lvl w:ilvl="8" w:tplc="151C388C">
+    <w:lvl w:ilvl="8" w:tplc="DC80CDC8">
       <w:numFmt w:val="decimal"/>
       <w:lvlText w:val=""/>
       <w:lvlJc w:val="left"/>
     </w:lvl>
   </w:abstractNum>
-  <w:abstractNum w:abstractNumId="3" w15:restartNumberingAfterBreak="0">
-    <w:nsid w:val="4BC7525B"/>
+  <w:abstractNum w:abstractNumId="6" w15:restartNumberingAfterBreak="0">
+    <w:nsid w:val="7EFD7FAE"/>
     <w:multiLevelType w:val="hybridMultilevel"/>
-    <w:tmpl w:val="7CE6EA2E"/>
-    <w:lvl w:ilvl="0" w:tplc="8C1450E2">
+    <w:tmpl w:val="2C1A299C"/>
+    <w:lvl w:ilvl="0" w:tplc="AFE2DC16">
       <w:start w:val="1"/>
       <w:numFmt w:val="bullet"/>
       <w:lvlText w:val="•"/>
@@ -4085,187 +4592,85 @@
         <w:ind w:left="640" w:hanging="320"/>
       </w:pPr>
     </w:lvl>
-    <w:lvl w:ilvl="1" w:tplc="4F1672F0">
+    <w:lvl w:ilvl="1" w:tplc="DA36EC86">
       <w:numFmt w:val="decimal"/>
       <w:lvlText w:val=""/>
       <w:lvlJc w:val="left"/>
     </w:lvl>
-    <w:lvl w:ilvl="2" w:tplc="FF7CE448">
+    <w:lvl w:ilvl="2" w:tplc="66089FF2">
       <w:numFmt w:val="decimal"/>
       <w:lvlText w:val=""/>
       <w:lvlJc w:val="left"/>
     </w:lvl>
-    <w:lvl w:ilvl="3" w:tplc="32AEAA12">
+    <w:lvl w:ilvl="3" w:tplc="7EC83B2C">
       <w:numFmt w:val="decimal"/>
       <w:lvlText w:val=""/>
       <w:lvlJc w:val="left"/>
     </w:lvl>
-    <w:lvl w:ilvl="4" w:tplc="1DDCDEE4">
+    <w:lvl w:ilvl="4" w:tplc="9B14C5C6">
       <w:numFmt w:val="decimal"/>
       <w:lvlText w:val=""/>
       <w:lvlJc w:val="left"/>
     </w:lvl>
-    <w:lvl w:ilvl="5" w:tplc="6F6ACC22">
+    <w:lvl w:ilvl="5" w:tplc="C4DE0DCE">
       <w:numFmt w:val="decimal"/>
       <w:lvlText w:val=""/>
       <w:lvlJc w:val="left"/>
     </w:lvl>
-    <w:lvl w:ilvl="6" w:tplc="D2686A70">
+    <w:lvl w:ilvl="6" w:tplc="0B3416FA">
       <w:numFmt w:val="decimal"/>
       <w:lvlText w:val=""/>
       <w:lvlJc w:val="left"/>
     </w:lvl>
-    <w:lvl w:ilvl="7" w:tplc="B9B6084A">
+    <w:lvl w:ilvl="7" w:tplc="E1CE4502">
       <w:numFmt w:val="decimal"/>
       <w:lvlText w:val=""/>
       <w:lvlJc w:val="left"/>
     </w:lvl>
-    <w:lvl w:ilvl="8" w:tplc="7C1EFDF8">
+    <w:lvl w:ilvl="8" w:tplc="BCA6C30C">
       <w:numFmt w:val="decimal"/>
       <w:lvlText w:val=""/>
       <w:lvlJc w:val="left"/>
     </w:lvl>
   </w:abstractNum>
-  <w:abstractNum w:abstractNumId="4" w15:restartNumberingAfterBreak="0">
-    <w:nsid w:val="535641CE"/>
-    <w:multiLevelType w:val="hybridMultilevel"/>
-    <w:tmpl w:val="A12A5C82"/>
-    <w:lvl w:ilvl="0" w:tplc="3D7AEE00">
-      <w:start w:val="1"/>
-      <w:numFmt w:val="decimal"/>
-      <w:lvlText w:val="%1."/>
-      <w:lvlJc w:val="left"/>
-      <w:pPr>
-        <w:ind w:left="640" w:hanging="360"/>
-      </w:pPr>
-    </w:lvl>
-    <w:lvl w:ilvl="1" w:tplc="0694C67A">
-      <w:numFmt w:val="decimal"/>
-      <w:lvlText w:val=""/>
-      <w:lvlJc w:val="left"/>
-    </w:lvl>
-    <w:lvl w:ilvl="2" w:tplc="BD2A9922">
-      <w:numFmt w:val="decimal"/>
-      <w:lvlText w:val=""/>
-      <w:lvlJc w:val="left"/>
-    </w:lvl>
-    <w:lvl w:ilvl="3" w:tplc="3D88EC86">
-      <w:numFmt w:val="decimal"/>
-      <w:lvlText w:val=""/>
-      <w:lvlJc w:val="left"/>
-    </w:lvl>
-    <w:lvl w:ilvl="4" w:tplc="98486E80">
-      <w:numFmt w:val="decimal"/>
-      <w:lvlText w:val=""/>
-      <w:lvlJc w:val="left"/>
-    </w:lvl>
-    <w:lvl w:ilvl="5" w:tplc="B720D878">
-      <w:numFmt w:val="decimal"/>
-      <w:lvlText w:val=""/>
-      <w:lvlJc w:val="left"/>
-    </w:lvl>
-    <w:lvl w:ilvl="6" w:tplc="19D0AE7C">
-      <w:numFmt w:val="decimal"/>
-      <w:lvlText w:val=""/>
-      <w:lvlJc w:val="left"/>
-    </w:lvl>
-    <w:lvl w:ilvl="7" w:tplc="5F0A735A">
-      <w:numFmt w:val="decimal"/>
-      <w:lvlText w:val=""/>
-      <w:lvlJc w:val="left"/>
-    </w:lvl>
-    <w:lvl w:ilvl="8" w:tplc="E5C4295A">
-      <w:numFmt w:val="decimal"/>
-      <w:lvlText w:val=""/>
-      <w:lvlJc w:val="left"/>
-    </w:lvl>
-  </w:abstractNum>
-  <w:abstractNum w:abstractNumId="5" w15:restartNumberingAfterBreak="0">
-    <w:nsid w:val="56C6304A"/>
-    <w:multiLevelType w:val="hybridMultilevel"/>
-    <w:tmpl w:val="9DC4064A"/>
-    <w:lvl w:ilvl="0" w:tplc="8DD22606">
-      <w:start w:val="1"/>
-      <w:numFmt w:val="decimal"/>
-      <w:lvlText w:val="%1."/>
-      <w:lvlJc w:val="left"/>
-      <w:pPr>
-        <w:ind w:left="640" w:hanging="360"/>
-      </w:pPr>
-    </w:lvl>
-    <w:lvl w:ilvl="1" w:tplc="16B6B592">
-      <w:numFmt w:val="decimal"/>
-      <w:lvlText w:val=""/>
-      <w:lvlJc w:val="left"/>
-    </w:lvl>
-    <w:lvl w:ilvl="2" w:tplc="580C286C">
-      <w:numFmt w:val="decimal"/>
-      <w:lvlText w:val=""/>
-      <w:lvlJc w:val="left"/>
-    </w:lvl>
-    <w:lvl w:ilvl="3" w:tplc="10840ABC">
-      <w:numFmt w:val="decimal"/>
-      <w:lvlText w:val=""/>
-      <w:lvlJc w:val="left"/>
-    </w:lvl>
-    <w:lvl w:ilvl="4" w:tplc="3B520792">
-      <w:numFmt w:val="decimal"/>
-      <w:lvlText w:val=""/>
-      <w:lvlJc w:val="left"/>
-    </w:lvl>
-    <w:lvl w:ilvl="5" w:tplc="D6BA4790">
-      <w:numFmt w:val="decimal"/>
-      <w:lvlText w:val=""/>
-      <w:lvlJc w:val="left"/>
-    </w:lvl>
-    <w:lvl w:ilvl="6" w:tplc="B86A700C">
-      <w:numFmt w:val="decimal"/>
-      <w:lvlText w:val=""/>
-      <w:lvlJc w:val="left"/>
-    </w:lvl>
-    <w:lvl w:ilvl="7" w:tplc="0204C40E">
-      <w:numFmt w:val="decimal"/>
-      <w:lvlText w:val=""/>
-      <w:lvlJc w:val="left"/>
-    </w:lvl>
-    <w:lvl w:ilvl="8" w:tplc="CEDC8CC6">
-      <w:numFmt w:val="decimal"/>
-      <w:lvlText w:val=""/>
-      <w:lvlJc w:val="left"/>
-    </w:lvl>
-  </w:abstractNum>
-  <w:num w:numId="1" w16cid:durableId="1351028150">
+  <w:num w:numId="1" w16cid:durableId="1886721359">
+    <w:abstractNumId w:val="4"/>
+    <w:lvlOverride w:ilvl="0">
+      <w:startOverride w:val="1"/>
+    </w:lvlOverride>
+  </w:num>
+  <w:num w:numId="2" w16cid:durableId="1390955558">
+    <w:abstractNumId w:val="6"/>
+    <w:lvlOverride w:ilvl="0">
+      <w:startOverride w:val="1"/>
+    </w:lvlOverride>
+  </w:num>
+  <w:num w:numId="3" w16cid:durableId="485249798">
     <w:abstractNumId w:val="1"/>
     <w:lvlOverride w:ilvl="0">
       <w:startOverride w:val="1"/>
     </w:lvlOverride>
   </w:num>
-  <w:num w:numId="2" w16cid:durableId="1824155781">
-    <w:abstractNumId w:val="3"/>
+  <w:num w:numId="4" w16cid:durableId="933591481">
+    <w:abstractNumId w:val="0"/>
     <w:lvlOverride w:ilvl="0">
       <w:startOverride w:val="1"/>
     </w:lvlOverride>
   </w:num>
-  <w:num w:numId="3" w16cid:durableId="416439645">
-    <w:abstractNumId w:val="4"/>
-    <w:lvlOverride w:ilvl="0">
-      <w:startOverride w:val="1"/>
-    </w:lvlOverride>
-  </w:num>
-  <w:num w:numId="4" w16cid:durableId="326792628">
+  <w:num w:numId="5" w16cid:durableId="34014890">
     <w:abstractNumId w:val="2"/>
     <w:lvlOverride w:ilvl="0">
       <w:startOverride w:val="1"/>
     </w:lvlOverride>
   </w:num>
-  <w:num w:numId="5" w16cid:durableId="330958271">
-    <w:abstractNumId w:val="0"/>
+  <w:num w:numId="6" w16cid:durableId="256640470">
+    <w:abstractNumId w:val="5"/>
     <w:lvlOverride w:ilvl="0">
       <w:startOverride w:val="1"/>
     </w:lvlOverride>
   </w:num>
-  <w:num w:numId="6" w16cid:durableId="1813789358">
-    <w:abstractNumId w:val="5"/>
+  <w:num w:numId="7" w16cid:durableId="798491533">
+    <w:abstractNumId w:val="3"/>
     <w:lvlOverride w:ilvl="0">
       <w:startOverride w:val="1"/>
     </w:lvlOverride>
@@ -4920,7 +5325,7 @@
     <w:autoRedefine/>
     <w:uiPriority w:val="39"/>
     <w:unhideWhenUsed/>
-    <w:rsid w:val="007D668B"/>
+    <w:rsid w:val="00775559"/>
     <w:pPr>
       <w:spacing w:after="100"/>
     </w:pPr>
@@ -4932,7 +5337,7 @@
     <w:autoRedefine/>
     <w:uiPriority w:val="39"/>
     <w:unhideWhenUsed/>
-    <w:rsid w:val="007D668B"/>
+    <w:rsid w:val="00775559"/>
     <w:pPr>
       <w:spacing w:after="100"/>
       <w:ind w:left="260"/>

</xml_diff>